<commit_message>
Add races creation chapter to history
Co-Authored-By: Claude Sonnet 5.5 <noreply@anthropic.com>
Claude-Session: https://claude.ai/code/session_01JpcpLvtS7aJ4eQsGwHD4Tg
</commit_message>
<xml_diff>
--- a/docx/Carya_Tarih.docx
+++ b/docx/Carya_Tarih.docx
@@ -743,6 +743,285 @@
           <w:rFonts w:ascii="Georgia" w:hAnsi="Georgia" w:cs="Georgia" w:eastAsia="Georgia"/>
         </w:rPr>
         <w:t>Savaşın en kanlı yıllarında yetişen adsız bir elf savaşçısı, Sessizlik Loncası’nın kurucusu sayılır (bkz. Gruplar ve Tarikatlar).</w:t>
+      </w:r>
+    </w:p>
+    <w:p>
+      <w:pPr>
+        <w:pStyle w:val="Heading1"/>
+        <w:keepNext w:val="1"/>
+        <w:keepLines w:val="1"/>
+        <w:spacing w:before="360" w:after="200" w:line="240" w:lineRule="auto"/>
+      </w:pPr>
+      <w:r>
+        <w:rPr>
+          <w:rFonts w:ascii="Georgia" w:hAnsi="Georgia" w:cs="Georgia" w:eastAsia="Georgia"/>
+          <w:b w:val="1"/>
+          <w:bCs w:val="1"/>
+          <w:color w:val="5B4A2E"/>
+          <w:sz w:val="32"/>
+          <w:szCs w:val="32"/>
+        </w:rPr>
+        <w:t>Irkların Yaratılışı</w:t>
+      </w:r>
+    </w:p>
+    <w:p>
+      <w:pPr>
+        <w:spacing w:after="160" w:line="276" w:lineRule="auto"/>
+        <w:jc w:val="both"/>
+      </w:pPr>
+      <w:r>
+        <w:rPr>
+          <w:rFonts w:ascii="Georgia" w:hAnsi="Georgia" w:cs="Georgia" w:eastAsia="Georgia"/>
+        </w:rPr>
+        <w:t>Carya’da yaşayan halkların kökeni tek bir kaynağa bağlı değildir. Kimi bir tanrının doğrudan çocuğudur, kimi bir tanrının bölünmesinden doğmuştur, kimi ise kökeni tartışılan rivayetlerin içinde kaybolmuştur.</w:t>
+      </w:r>
+    </w:p>
+    <w:p>
+      <w:pPr>
+        <w:pStyle w:val="Heading2"/>
+        <w:keepNext w:val="1"/>
+        <w:keepLines w:val="1"/>
+        <w:spacing w:before="240" w:after="140" w:line="240" w:lineRule="auto"/>
+      </w:pPr>
+      <w:r>
+        <w:rPr>
+          <w:rFonts w:ascii="Georgia" w:hAnsi="Georgia" w:cs="Georgia" w:eastAsia="Georgia"/>
+          <w:b w:val="1"/>
+          <w:bCs w:val="1"/>
+          <w:color w:val="6E5A38"/>
+          <w:sz w:val="26"/>
+          <w:szCs w:val="26"/>
+        </w:rPr>
+        <w:t>İnsanlar</w:t>
+      </w:r>
+    </w:p>
+    <w:p>
+      <w:pPr>
+        <w:spacing w:after="160" w:line="276" w:lineRule="auto"/>
+        <w:jc w:val="both"/>
+      </w:pPr>
+      <w:r>
+        <w:rPr>
+          <w:rFonts w:ascii="Georgia" w:hAnsi="Georgia" w:cs="Georgia" w:eastAsia="Georgia"/>
+        </w:rPr>
+        <w:t>İnsanları Amarath ile Alarath yaratmıştır. Cennet ve cehennem düzeni de bu yüzden onlar için kurulmuştur.</w:t>
+      </w:r>
+    </w:p>
+    <w:p>
+      <w:pPr>
+        <w:pStyle w:val="Heading2"/>
+        <w:keepNext w:val="1"/>
+        <w:keepLines w:val="1"/>
+        <w:spacing w:before="240" w:after="140" w:line="240" w:lineRule="auto"/>
+      </w:pPr>
+      <w:r>
+        <w:rPr>
+          <w:rFonts w:ascii="Georgia" w:hAnsi="Georgia" w:cs="Georgia" w:eastAsia="Georgia"/>
+          <w:b w:val="1"/>
+          <w:bCs w:val="1"/>
+          <w:color w:val="6E5A38"/>
+          <w:sz w:val="26"/>
+          <w:szCs w:val="26"/>
+        </w:rPr>
+        <w:t>Elfler</w:t>
+      </w:r>
+    </w:p>
+    <w:p>
+      <w:pPr>
+        <w:spacing w:after="160" w:line="276" w:lineRule="auto"/>
+        <w:jc w:val="both"/>
+      </w:pPr>
+      <w:r>
+        <w:rPr>
+          <w:rFonts w:ascii="Georgia" w:hAnsi="Georgia" w:cs="Georgia" w:eastAsia="Georgia"/>
+        </w:rPr>
+        <w:t>Elfler, Asuryani’nin ilk atası olduğu halktır. Ateş Savaşı’nda Asuryani altı parçaya bölününce elfler de bu bütünün yankısını taşımaya devam etti.</w:t>
+      </w:r>
+    </w:p>
+    <w:p>
+      <w:pPr>
+        <w:pStyle w:val="Heading2"/>
+        <w:keepNext w:val="1"/>
+        <w:keepLines w:val="1"/>
+        <w:spacing w:before="240" w:after="140" w:line="240" w:lineRule="auto"/>
+      </w:pPr>
+      <w:r>
+        <w:rPr>
+          <w:rFonts w:ascii="Georgia" w:hAnsi="Georgia" w:cs="Georgia" w:eastAsia="Georgia"/>
+          <w:b w:val="1"/>
+          <w:bCs w:val="1"/>
+          <w:color w:val="6E5A38"/>
+          <w:sz w:val="26"/>
+          <w:szCs w:val="26"/>
+        </w:rPr>
+        <w:t>Drowlar</w:t>
+      </w:r>
+    </w:p>
+    <w:p>
+      <w:pPr>
+        <w:spacing w:after="160" w:line="276" w:lineRule="auto"/>
+        <w:jc w:val="both"/>
+      </w:pPr>
+      <w:r>
+        <w:rPr>
+          <w:rFonts w:ascii="Georgia" w:hAnsi="Georgia" w:cs="Georgia" w:eastAsia="Georgia"/>
+        </w:rPr>
+        <w:t>Asuryani’nin bölünmesinden sonra elflerden bir grup Loth’u izledi. Güneşten uzak yaşayan bu halk kendi karanlık büyü ritüellerini kültür edindi; zamanla hem bedenlerine hem büyülerine bu karanlık bir kül gibi yapıştı ve derileri kara-gri bir renge büründü. Drowlar bu soydan gelir.</w:t>
+      </w:r>
+    </w:p>
+    <w:p>
+      <w:pPr>
+        <w:pStyle w:val="Heading2"/>
+        <w:keepNext w:val="1"/>
+        <w:keepLines w:val="1"/>
+        <w:spacing w:before="240" w:after="140" w:line="240" w:lineRule="auto"/>
+      </w:pPr>
+      <w:r>
+        <w:rPr>
+          <w:rFonts w:ascii="Georgia" w:hAnsi="Georgia" w:cs="Georgia" w:eastAsia="Georgia"/>
+          <w:b w:val="1"/>
+          <w:bCs w:val="1"/>
+          <w:color w:val="6E5A38"/>
+          <w:sz w:val="26"/>
+          <w:szCs w:val="26"/>
+        </w:rPr>
+        <w:t>Cüceler, Duergarlar ve Gnomelar</w:t>
+      </w:r>
+    </w:p>
+    <w:p>
+      <w:pPr>
+        <w:spacing w:after="160" w:line="276" w:lineRule="auto"/>
+        <w:jc w:val="both"/>
+      </w:pPr>
+      <w:r>
+        <w:rPr>
+          <w:rFonts w:ascii="Georgia" w:hAnsi="Georgia" w:cs="Georgia" w:eastAsia="Georgia"/>
+        </w:rPr>
+        <w:t>Cüceler Morad’ın halkıdır. Morad’ın Astral boyuttan edindiği iki çırağın izleri de iki ayrı halkta yaşar: Abbator’un karanlık gururu duergarlarda, Zuldynag’ın merakı ve canlı zihni gnomelarda sürer.</w:t>
+      </w:r>
+    </w:p>
+    <w:p>
+      <w:pPr>
+        <w:pStyle w:val="Heading2"/>
+        <w:keepNext w:val="1"/>
+        <w:keepLines w:val="1"/>
+        <w:spacing w:before="240" w:after="140" w:line="240" w:lineRule="auto"/>
+      </w:pPr>
+      <w:r>
+        <w:rPr>
+          <w:rFonts w:ascii="Georgia" w:hAnsi="Georgia" w:cs="Georgia" w:eastAsia="Georgia"/>
+          <w:b w:val="1"/>
+          <w:bCs w:val="1"/>
+          <w:color w:val="6E5A38"/>
+          <w:sz w:val="26"/>
+          <w:szCs w:val="26"/>
+        </w:rPr>
+        <w:t>Yeşilderili Halklar</w:t>
+      </w:r>
+    </w:p>
+    <w:p>
+      <w:pPr>
+        <w:spacing w:after="160" w:line="276" w:lineRule="auto"/>
+        <w:jc w:val="both"/>
+      </w:pPr>
+      <w:r>
+        <w:rPr>
+          <w:rFonts w:ascii="Georgia" w:hAnsi="Georgia" w:cs="Georgia" w:eastAsia="Georgia"/>
+        </w:rPr>
+        <w:t>Yeşilderili halklar Gork ile Morg’un çocuklarıdır. Orklar, goblinler ve aralarındaki karışımlar bu çatı altında anılır. Gork ile Morg çocuklarını kimseye danışmadan daha sert ve daha ayrıksı bir yola yöneltmiştir; bu yüzden onların çocukları her zaman diğerlerinden farklı olmuştur.</w:t>
+      </w:r>
+    </w:p>
+    <w:p>
+      <w:pPr>
+        <w:pStyle w:val="Heading2"/>
+        <w:keepNext w:val="1"/>
+        <w:keepLines w:val="1"/>
+        <w:spacing w:before="240" w:after="140" w:line="240" w:lineRule="auto"/>
+      </w:pPr>
+      <w:r>
+        <w:rPr>
+          <w:rFonts w:ascii="Georgia" w:hAnsi="Georgia" w:cs="Georgia" w:eastAsia="Georgia"/>
+          <w:b w:val="1"/>
+          <w:bCs w:val="1"/>
+          <w:color w:val="6E5A38"/>
+          <w:sz w:val="26"/>
+          <w:szCs w:val="26"/>
+        </w:rPr>
+        <w:t>Goliathlar</w:t>
+      </w:r>
+    </w:p>
+    <w:p>
+      <w:pPr>
+        <w:spacing w:after="160" w:line="276" w:lineRule="auto"/>
+        <w:jc w:val="both"/>
+      </w:pPr>
+      <w:r>
+        <w:rPr>
+          <w:rFonts w:ascii="Georgia" w:hAnsi="Georgia" w:cs="Georgia" w:eastAsia="Georgia"/>
+        </w:rPr>
+        <w:t>Goliathların kökeni belirsizdir. Rivayete göre devlerin soyundan gelirler; devlerin ise doğadan, Viridia’dan doğduğu söylenir. Bunu doğrulayan ya da çürüten kesin bir kayıt yoktur.</w:t>
+      </w:r>
+    </w:p>
+    <w:p>
+      <w:pPr>
+        <w:pStyle w:val="Heading2"/>
+        <w:keepNext w:val="1"/>
+        <w:keepLines w:val="1"/>
+        <w:spacing w:before="240" w:after="140" w:line="240" w:lineRule="auto"/>
+      </w:pPr>
+      <w:r>
+        <w:rPr>
+          <w:rFonts w:ascii="Georgia" w:hAnsi="Georgia" w:cs="Georgia" w:eastAsia="Georgia"/>
+          <w:b w:val="1"/>
+          <w:bCs w:val="1"/>
+          <w:color w:val="6E5A38"/>
+          <w:sz w:val="26"/>
+          <w:szCs w:val="26"/>
+        </w:rPr>
+        <w:t>Halflingler</w:t>
+      </w:r>
+    </w:p>
+    <w:p>
+      <w:pPr>
+        <w:spacing w:after="160" w:line="276" w:lineRule="auto"/>
+        <w:jc w:val="both"/>
+      </w:pPr>
+      <w:r>
+        <w:rPr>
+          <w:rFonts w:ascii="Georgia" w:hAnsi="Georgia" w:cs="Georgia" w:eastAsia="Georgia"/>
+        </w:rPr>
+        <w:t>Halflingler Carya’nın en genç halklarındandır. Kökenleri belirsizdir; Asuryani’nin altı parçaya bölünmesinden çok sonra ortaya çıktıkları ve bu altı parçadan birine bağlı oldukları rivayet edilir. Hangisine bağlı oldukları bilinmez.</w:t>
+      </w:r>
+    </w:p>
+    <w:p>
+      <w:pPr>
+        <w:pStyle w:val="Heading2"/>
+        <w:keepNext w:val="1"/>
+        <w:keepLines w:val="1"/>
+        <w:spacing w:before="240" w:after="140" w:line="240" w:lineRule="auto"/>
+      </w:pPr>
+      <w:r>
+        <w:rPr>
+          <w:rFonts w:ascii="Georgia" w:hAnsi="Georgia" w:cs="Georgia" w:eastAsia="Georgia"/>
+          <w:b w:val="1"/>
+          <w:bCs w:val="1"/>
+          <w:color w:val="6E5A38"/>
+          <w:sz w:val="26"/>
+          <w:szCs w:val="26"/>
+        </w:rPr>
+        <w:t>Cinler</w:t>
+      </w:r>
+    </w:p>
+    <w:p>
+      <w:pPr>
+        <w:spacing w:after="160" w:line="276" w:lineRule="auto"/>
+        <w:jc w:val="both"/>
+      </w:pPr>
+      <w:r>
+        <w:rPr>
+          <w:rFonts w:ascii="Georgia" w:hAnsi="Georgia" w:cs="Georgia" w:eastAsia="Georgia"/>
+        </w:rPr>
+        <w:t>Cinler küçük tanrılar gibidir; nereden geldikleri bilinmez. Ne melektirler ne şeytan; kendi ajandalarını izlerler. Ölümlüler arasında kolay dolaşamazlar. Ruh gibidirler ama bir biçimde bu evrene de bağlıdırlar; çoğu bir cisme tutsak ve bağlıdır. Cisimden özgür kalanlar Carya’ya yakın manevi âlemde dilediğince gezer ya da amaçları doğrultusunda Carya’da faaliyet yürütmek ister. Bunların sayısı çok azdır.</w:t>
       </w:r>
     </w:p>
     <w:p>

</xml_diff>